<commit_message>
PR7: audit fixes (widest key, no-mistake slip, hole label, f(-1) wording, end-quantity speech, coverage), audit md, README row
Co-Authored-By: Claude Opus 5.5 <noreply@anthropic.com>
Claude-Session: https://claude.ai/code/session_013Y8PfETWcMLvmUEpCdE8Wq
</commit_message>
<xml_diff>
--- a/support-materials/PR7/PR7_worked_examples.docx
+++ b/support-materials/PR7/PR7_worked_examples.docx
@@ -195,7 +195,7 @@
         <w:t xml:space="preserve">D.  </w:t>
       </w:r>
       <w:r>
-        <w:t xml:space="preserve">A hole at x = −4, and a vertical asymptote at x = 1</w:t>
+        <w:t xml:space="preserve">A zero at x = 4, and a vertical asymptote at x = −1</w:t>
       </w:r>
     </w:p>
     <w:p>
@@ -269,27 +269,17 @@
         <w:t xml:space="preserve">x=−1</w:t>
       </w:r>
       <w:r>
-        <w:t xml:space="preserve"> is a vertical asymptote. Calling both asymptotes misses the cancelling; the swapped version mixes up which factor cancels; and </w:t>
-      </w:r>
-      <w:r>
-        <w:rPr>
-          <w:i/>
-          <w:iCs/>
-        </w:rPr>
-        <w:t xml:space="preserve">−4</w:t>
-      </w:r>
-      <w:r>
-        <w:t xml:space="preserve"> and </w:t>
-      </w:r>
-      <w:r>
-        <w:rPr>
-          <w:i/>
-          <w:iCs/>
-        </w:rPr>
-        <w:t xml:space="preserve">1</w:t>
-      </w:r>
-      <w:r>
-        <w:t xml:space="preserve"> read the signs as written. </w:t>
+        <w:t xml:space="preserve"> is a vertical asymptote. Calling both asymptotes misses the cancelling; the swapped version mixes up which factor cancels; and calling 4 a zero misses that </w:t>
+      </w:r>
+      <w:r>
+        <w:rPr>
+          <w:i/>
+          <w:iCs/>
+        </w:rPr>
+        <w:t xml:space="preserve">(x−4)</w:t>
+      </w:r>
+      <w:r>
+        <w:t xml:space="preserve"> cancels. </w:t>
       </w:r>
       <w:r>
         <w:rPr>
@@ -413,7 +403,7 @@
           <w:i/>
           <w:iCs/>
         </w:rPr>
-        <w:t xml:space="preserve">−1/3</w:t>
+        <w:t xml:space="preserve">−5/12</w:t>
       </w:r>
     </w:p>
     <w:p>
@@ -430,14 +420,14 @@
         <w:spacing w:after="120" w:before="80" w:line="300"/>
       </w:pPr>
       <w:r>
-        <w:t xml:space="preserve">Cancel first: </w:t>
-      </w:r>
-      <w:r>
-        <w:rPr>
-          <w:i/>
-          <w:iCs/>
-        </w:rPr>
-        <w:t xml:space="preserve">f(x)=(−(x+5))/(3(x+4))</w:t>
+        <w:t xml:space="preserve">Cancel first; away from the hole, the formula is </w:t>
+      </w:r>
+      <w:r>
+        <w:rPr>
+          <w:i/>
+          <w:iCs/>
+        </w:rPr>
+        <w:t xml:space="preserve">(−(x+5))/(3(x+4))</w:t>
       </w:r>
       <w:r>
         <w:t xml:space="preserve">. Then plug in 2: </w:t>
@@ -487,10 +477,20 @@
           <w:i/>
           <w:iCs/>
         </w:rPr>
-        <w:t xml:space="preserve">−1/3</w:t>
-      </w:r>
-      <w:r>
-        <w:t xml:space="preserve"> is the horizontal asymptote, the ratio of the leading coefficients. </w:t>
+        <w:t xml:space="preserve">−5/12</w:t>
+      </w:r>
+      <w:r>
+        <w:t xml:space="preserve"> comes from plugging in 0 instead of 2, which gives the </w:t>
+      </w:r>
+      <w:r>
+        <w:rPr>
+          <w:i/>
+          <w:iCs/>
+        </w:rPr>
+        <w:t xml:space="preserve">y</w:t>
+      </w:r>
+      <w:r>
+        <w:t xml:space="preserve">-intercept. </w:t>
       </w:r>
       <w:r>
         <w:rPr>
@@ -657,14 +657,14 @@
         <w:t xml:space="preserve">(x−3)</w:t>
       </w:r>
       <w:r>
-        <w:t xml:space="preserve">, cancels with the bottom, which leaves </w:t>
-      </w:r>
-      <w:r>
-        <w:rPr>
-          <w:i/>
-          <w:iCs/>
-        </w:rPr>
-        <w:t xml:space="preserve">f(x)=(−4)/(5(x+2)</w:t>
+        <w:t xml:space="preserve">, cancels with the bottom, which leaves the formula </w:t>
+      </w:r>
+      <w:r>
+        <w:rPr>
+          <w:i/>
+          <w:iCs/>
+        </w:rPr>
+        <w:t xml:space="preserve">(−4)/(5(x+2)</w:t>
       </w:r>
       <w:r>
         <w:rPr>
@@ -682,7 +682,7 @@
         <w:t xml:space="preserve">)</w:t>
       </w:r>
       <w:r>
-        <w:t xml:space="preserve">. The top is now just </w:t>
+        <w:t xml:space="preserve"> everywhere except the hole. The top is now just </w:t>
       </w:r>
       <w:r>
         <w:rPr>
@@ -930,7 +930,7 @@
         <w:t xml:space="preserve">(x−3)</w:t>
       </w:r>
       <w:r>
-        <w:t xml:space="preserve"> changes the formula, not the domain, so 3 stays out, as the hole. "Except 1" alone forgets the hole, and −2 makes the top 0, which is allowed, so it does not belong on the list. </w:t>
+        <w:t xml:space="preserve"> changes the formula, not the domain, so 3 stays out, as the hole. "Except 1" alone forgets the hole, and −2 makes the top 0, which is allowed, so it does not belong on the list. "Except −2 and 3" uses the factors on the top instead of the bottom. </w:t>
       </w:r>
       <w:r>
         <w:rPr>
@@ -1231,26 +1231,7 @@
           <w:sz w:val="40"/>
           <w:szCs w:val="40"/>
         </w:rPr>
-        <w:t xml:space="preserve">f(x)=(−3(x−2))/(2(x−2)(x+1)</w:t>
-      </w:r>
-      <w:r>
-        <w:rPr>
-          <w:i/>
-          <w:iCs/>
-          <w:sz w:val="40"/>
-          <w:szCs w:val="40"/>
-          <w:vertAlign w:val="superscript"/>
-        </w:rPr>
-        <w:t xml:space="preserve">2</w:t>
-      </w:r>
-      <w:r>
-        <w:rPr>
-          <w:i/>
-          <w:iCs/>
-          <w:sz w:val="40"/>
-          <w:szCs w:val="40"/>
-        </w:rPr>
-        <w:t xml:space="preserve">)</w:t>
+        <w:t xml:space="preserve">f(x)=(−3(x−2))/(2(x−2)(x+1))</w:t>
       </w:r>
     </w:p>
     <w:p>
@@ -1360,7 +1341,7 @@
         <w:spacing w:after="120" w:before="80" w:line="300"/>
       </w:pPr>
       <w:r>
-        <w:t xml:space="preserve">The top has degree 1 and the bottom has degree 3. When the bottom wins, the fraction shrinks toward 0 far out, so the asymptote is </w:t>
+        <w:t xml:space="preserve">The top has degree 1 and the bottom has degree 2. When the bottom wins, the fraction shrinks toward 0 far out, so the asymptote is </w:t>
       </w:r>
       <w:r>
         <w:rPr>
@@ -2075,27 +2056,47 @@
         <w:t xml:space="preserve">(2(x−3))/(x−1)</w:t>
       </w:r>
       <w:r>
-        <w:t xml:space="preserve"> gives </w:t>
-      </w:r>
-      <w:r>
-        <w:rPr>
-          <w:i/>
-          <w:iCs/>
-        </w:rPr>
-        <w:t xml:space="preserve">f(0)=6</w:t>
-      </w:r>
-      <w:r>
-        <w:t xml:space="preserve"> and </w:t>
-      </w:r>
-      <w:r>
-        <w:rPr>
-          <w:i/>
-          <w:iCs/>
-        </w:rPr>
-        <w:t xml:space="preserve">f(−1)=4</w:t>
-      </w:r>
-      <w:r>
-        <w:t xml:space="preserve">. Swapping the hole and the asymptote gives the first formula; the 2 on the bottom levels off at </w:t>
+        <w:t xml:space="preserve"> gives 6 at </w:t>
+      </w:r>
+      <w:r>
+        <w:rPr>
+          <w:i/>
+          <w:iCs/>
+        </w:rPr>
+        <w:t xml:space="preserve">x=0</w:t>
+      </w:r>
+      <w:r>
+        <w:t xml:space="preserve"> and 4 at </w:t>
+      </w:r>
+      <w:r>
+        <w:rPr>
+          <w:i/>
+          <w:iCs/>
+        </w:rPr>
+        <w:t xml:space="preserve">x=−1</w:t>
+      </w:r>
+      <w:r>
+        <w:t xml:space="preserve">, the height of the hole. Cancelling </w:t>
+      </w:r>
+      <w:r>
+        <w:rPr>
+          <w:i/>
+          <w:iCs/>
+        </w:rPr>
+        <w:t xml:space="preserve">(x−1)</w:t>
+      </w:r>
+      <w:r>
+        <w:t xml:space="preserve"> instead of </w:t>
+      </w:r>
+      <w:r>
+        <w:rPr>
+          <w:i/>
+          <w:iCs/>
+        </w:rPr>
+        <w:t xml:space="preserve">(x+1)</w:t>
+      </w:r>
+      <w:r>
+        <w:t xml:space="preserve"> swaps the hole and the asymptote; the 2 on the bottom levels off at </w:t>
       </w:r>
       <w:r>
         <w:rPr>
@@ -2272,14 +2273,14 @@
         <w:spacing w:after="120" w:before="80" w:line="300"/>
       </w:pPr>
       <w:r>
-        <w:t xml:space="preserve">Cancelled, </w:t>
-      </w:r>
-      <w:r>
-        <w:rPr>
-          <w:i/>
-          <w:iCs/>
-        </w:rPr>
-        <w:t xml:space="preserve">f(x)=(−2)/(3(x−2)</w:t>
+        <w:t xml:space="preserve">Cancelled, the formula is </w:t>
+      </w:r>
+      <w:r>
+        <w:rPr>
+          <w:i/>
+          <w:iCs/>
+        </w:rPr>
+        <w:t xml:space="preserve">(−2)/(3(x−2)</w:t>
       </w:r>
       <w:r>
         <w:rPr>
@@ -2297,7 +2298,7 @@
         <w:t xml:space="preserve">)</w:t>
       </w:r>
       <w:r>
-        <w:t xml:space="preserve">. Near </w:t>
+        <w:t xml:space="preserve">, away from the hole. Near </w:t>
       </w:r>
       <w:r>
         <w:rPr>
@@ -2393,7 +2394,7 @@
           <wp:inline distT="0" distB="0" distL="0" distR="0">
             <wp:extent cx="3086100" cy="2476500"/>
             <wp:effectExtent t="0" r="0" b="0" l="0"/>
-            <wp:docPr id="1" name="sk3" descr="The graph of a rational function with one dashed vertical line. Plotted data: A graph on axes with x from −6 to 9 and y from −10 to 20. A dashed vertical line is at x = 3; there is no horizontal dashed line. Left of x = 3, the curve rises from the lower left to just touch the x-axis at (−2, 0), turns down through (0, −2/3) and an open circle at (1, −9/4), and drops beside x = 3. Right of x = 3, the curve comes down from the top, bottoms out near (8, 10), and then rises again to the right. The two intercepts and the open circle are labeled." title="The graph of a rational function with one dashed vertical line"/>
+            <wp:docPr id="1" name="sk3" descr="The graph of a rational function with one dashed vertical line. Plotted data: A graph on axes with x from −6 to 9 and y from −10 to 20. A dashed vertical line is at x = 3; no other dashed lines are drawn. Left of x = 3, the curve rises from the lower left to just touch the x-axis at (−2, 0), turns down through (0, −2/3) and an open circle at x = 1, a little below the x-axis, and drops beside x = 3. Right of x = 3, the curve comes down from the top, bottoms out near (8, 10), and then rises again to the right. The two intercepts are labeled." title="The graph of a rational function with one dashed vertical line"/>
             <wp:cNvGraphicFramePr>
               <a:graphicFrameLocks xmlns:a="http://schemas.openxmlformats.org/drawingml/2006/main" noChangeAspect="1"/>
             </wp:cNvGraphicFramePr>
@@ -2447,7 +2448,7 @@
           <w:sz w:val="22"/>
           <w:szCs w:val="22"/>
         </w:rPr>
-        <w:t xml:space="preserve">A graph on axes with x from −6 to 9 and y from −10 to 20. A dashed vertical line is at x = 3; there is no horizontal dashed line. Left of x = 3, the curve rises from the lower left to just touch the x-axis at (−2, 0), turns down through (0, −2/3) and an open circle at (1, −9/4), and drops beside x = 3. Right of x = 3, the curve comes down from the top, bottoms out near (8, 10), and then rises again to the right. The two intercepts and the open circle are labeled.</w:t>
+        <w:t xml:space="preserve">A graph on axes with x from −6 to 9 and y from −10 to 20. A dashed vertical line is at x = 3; no other dashed lines are drawn. Left of x = 3, the curve rises from the lower left to just touch the x-axis at (−2, 0), turns down through (0, −2/3) and an open circle at x = 1, a little below the x-axis, and drops beside x = 3. Right of x = 3, the curve comes down from the top, bottoms out near (8, 10), and then rises again to the right. The two intercepts are labeled.</w:t>
       </w:r>
     </w:p>
     <w:p>
@@ -2514,7 +2515,7 @@
         <w:t xml:space="preserve">A.  </w:t>
       </w:r>
       <w:r>
-        <w:t xml:space="preserve">Asymptotes x = 1 and x = 3; no horizontal asymptote; zero −2</w:t>
+        <w:t xml:space="preserve">Hole (1, 0); asymptote x = 3; no horizontal asymptote; zero −2</w:t>
       </w:r>
     </w:p>
     <w:p>
@@ -2546,7 +2547,7 @@
         <w:t xml:space="preserve">C.  </w:t>
       </w:r>
       <w:r>
-        <w:t xml:space="preserve">Hole (3, −9/4); asymptote x = 1; no horizontal asymptote; zero −2</w:t>
+        <w:t xml:space="preserve">Hole (1, −9/2); asymptote x = 3; no horizontal asymptote; zero −2</w:t>
       </w:r>
     </w:p>
     <w:p>
@@ -2641,17 +2642,27 @@
         <w:t xml:space="preserve">x=3</w:t>
       </w:r>
       <w:r>
-        <w:t xml:space="preserve">. The top has degree 3 and the bottom degree 2, so the graph never levels off; far out it heads up on the right and down on the left. The zero is −2, where the squared factor makes the graph touch the axis and turn. Calling </w:t>
-      </w:r>
-      <w:r>
-        <w:rPr>
-          <w:i/>
-          <w:iCs/>
-        </w:rPr>
-        <w:t xml:space="preserve">x=1</w:t>
-      </w:r>
-      <w:r>
-        <w:t xml:space="preserve"> an asymptote misses the cancelling; </w:t>
+        <w:t xml:space="preserve">. The top has degree 3 and the bottom degree 2, so the graph never levels off; far out it heads up on the right and down on the left. The zero is −2, where the squared factor makes the graph touch the axis and turn. A height of 0 reads the original's </w:t>
+      </w:r>
+      <w:r>
+        <w:rPr>
+          <w:i/>
+          <w:iCs/>
+        </w:rPr>
+        <w:t xml:space="preserve">0/0</w:t>
+      </w:r>
+      <w:r>
+        <w:t xml:space="preserve"> as 0; </w:t>
+      </w:r>
+      <w:r>
+        <w:rPr>
+          <w:i/>
+          <w:iCs/>
+        </w:rPr>
+        <w:t xml:space="preserve">−9/2</w:t>
+      </w:r>
+      <w:r>
+        <w:t xml:space="preserve"> forgets the 2 on the bottom; and </w:t>
       </w:r>
       <w:r>
         <w:rPr>
@@ -2661,7 +2672,7 @@
         <w:t xml:space="preserve">y=1/2</w:t>
       </w:r>
       <w:r>
-        <w:t xml:space="preserve"> would need equal degrees; and swapping 1 and 3 mixes up which factor cancels. </w:t>
+        <w:t xml:space="preserve"> would need equal degrees. </w:t>
       </w:r>
       <w:r>
         <w:rPr>
@@ -2741,7 +2752,7 @@
         <w:spacing w:after="120" w:before="80" w:line="300"/>
       </w:pPr>
       <w:r>
-        <w:t xml:space="preserve">CheckIt will ask you to sketch this. Reading from left to right, which description is right?</w:t>
+        <w:t xml:space="preserve">CheckIt will ask you to sketch this. The graph crosses the x-axis at −3 and passes through (0, −6). Reading from left to right, which description is right?</w:t>
       </w:r>
     </w:p>
     <w:p>
@@ -2757,7 +2768,7 @@
         <w:t xml:space="preserve">A.  </w:t>
       </w:r>
       <w:r>
-        <w:t xml:space="preserve">Near y = 2, crosses at −3, through (0, −6), down beside x = 1; then from the top, a hole at (2, 10), back toward y = 2</w:t>
+        <w:t xml:space="preserve">Near y = 2, down beside x = 1; then from the top, a hole at (2, 10), back toward y = 2</w:t>
       </w:r>
     </w:p>
     <w:p>
@@ -2773,7 +2784,7 @@
         <w:t xml:space="preserve">B.  </w:t>
       </w:r>
       <w:r>
-        <w:t xml:space="preserve">Near y = 2, crosses at −3, through (0, −6), up beside x = 1; then from the bottom, a hole at (2, 10), back toward y = 2</w:t>
+        <w:t xml:space="preserve">Near y = 2, up beside x = 1; then from the bottom, a hole at (2, 10), back toward y = 2</w:t>
       </w:r>
     </w:p>
     <w:p>
@@ -2789,7 +2800,7 @@
         <w:t xml:space="preserve">C.  </w:t>
       </w:r>
       <w:r>
-        <w:t xml:space="preserve">Near y = 0, crosses at −3, through (0, −6), down beside x = 1; then from the top, a hole at (2, 10), back toward y = 0</w:t>
+        <w:t xml:space="preserve">Near y = 0, down beside x = 1; then from the top, a hole at (2, 10), back toward y = 0</w:t>
       </w:r>
     </w:p>
     <w:p>
@@ -2805,7 +2816,7 @@
         <w:t xml:space="preserve">D.  </w:t>
       </w:r>
       <w:r>
-        <w:t xml:space="preserve">Near y = 2, crosses at −3, through (0, −6), down beside x = 1; then from the top, down beside x = 2, back toward y = 2</w:t>
+        <w:t xml:space="preserve">Near y = 2, down beside x = 1; then from the top, down beside x = 2, back toward y = 2</w:t>
       </w:r>
     </w:p>
     <w:p>
@@ -2822,17 +2833,17 @@
         <w:spacing w:after="120" w:before="80" w:line="300"/>
       </w:pPr>
       <w:r>
-        <w:t xml:space="preserve">Cancelled, </w:t>
-      </w:r>
-      <w:r>
-        <w:rPr>
-          <w:i/>
-          <w:iCs/>
-        </w:rPr>
-        <w:t xml:space="preserve">f(x)=(2(x+3))/(x−1)</w:t>
-      </w:r>
-      <w:r>
-        <w:t xml:space="preserve">. Equal degrees with </w:t>
+        <w:t xml:space="preserve">Cancelled, the formula is </w:t>
+      </w:r>
+      <w:r>
+        <w:rPr>
+          <w:i/>
+          <w:iCs/>
+        </w:rPr>
+        <w:t xml:space="preserve">(2(x+3))/(x−1)</w:t>
+      </w:r>
+      <w:r>
+        <w:t xml:space="preserve">, away from the hole. Equal degrees with </w:t>
       </w:r>
       <w:r>
         <w:rPr>
@@ -3330,7 +3341,7 @@
           <w:sz w:val="40"/>
           <w:szCs w:val="40"/>
         </w:rPr>
-        <w:t xml:space="preserve">f(x)=(2(x−4))/(3(x−1))</w:t>
+        <w:t xml:space="preserve">(2(x−4))/(3(x−1))</w:t>
       </w:r>
     </w:p>
     <w:p>
@@ -3345,7 +3356,7 @@
           <w:sz w:val="40"/>
           <w:szCs w:val="40"/>
         </w:rPr>
-        <w:t xml:space="preserve">f(−3)=(2(−7))/(3(−4))=7/6</w:t>
+        <w:t xml:space="preserve">(2(−7))/(3(−4))=7/6</w:t>
       </w:r>
     </w:p>
     <w:p>
@@ -3372,7 +3383,7 @@
         <w:t xml:space="preserve">f(x)=(2(x−4)(x+3))/(3(x+3)(x−1))</w:t>
       </w:r>
       <w:r>
-        <w:t xml:space="preserve">, a student cancelled, plugged in, and said the hole is (−3, 7/6). What is the mistake, if any?</w:t>
+        <w:t xml:space="preserve">, a student wrote the cancelled form (first line), plugged in −3 (second line), and said the hole is (−3, 7/6). What is the mistake, if any?</w:t>
       </w:r>
     </w:p>
     <w:p>
@@ -3655,14 +3666,14 @@
         <w:t xml:space="preserve">(x+1)</w:t>
       </w:r>
       <w:r>
-        <w:t xml:space="preserve"> is on the top and the bottom, so it cancels: </w:t>
-      </w:r>
-      <w:r>
-        <w:rPr>
-          <w:i/>
-          <w:iCs/>
-        </w:rPr>
-        <w:t xml:space="preserve">f(x)=5/(2(x−4)</w:t>
+        <w:t xml:space="preserve"> is on the top and the bottom, so it cancels, leaving the formula </w:t>
+      </w:r>
+      <w:r>
+        <w:rPr>
+          <w:i/>
+          <w:iCs/>
+        </w:rPr>
+        <w:t xml:space="preserve">5/(2(x−4)</w:t>
       </w:r>
       <w:r>
         <w:rPr>
@@ -3680,7 +3691,7 @@
         <w:t xml:space="preserve">)</w:t>
       </w:r>
       <w:r>
-        <w:t xml:space="preserve">. The top is now 5, never 0, so there are no zeros, and </w:t>
+        <w:t xml:space="preserve"> away from the hole. The top is now 5, never 0, so there are no zeros, and </w:t>
       </w:r>
       <w:r>
         <w:rPr>

</xml_diff>

<commit_message>
PR7: add a direct vertical-asymptote item (replaces Domain; domain now in its feedback)
Co-Authored-By: Claude Opus 5.5 <noreply@anthropic.com>
Claude-Session: https://claude.ai/code/session_013Y8PfETWcMLvmUEpCdE8Wq
</commit_message>
<xml_diff>
--- a/support-materials/PR7/PR7_worked_examples.docx
+++ b/support-materials/PR7/PR7_worked_examples.docx
@@ -758,7 +758,7 @@
         <w:pageBreakBefore/>
       </w:pPr>
       <w:r>
-        <w:t xml:space="preserve">Example 4: Domain</w:t>
+        <w:t xml:space="preserve">Example 4: Vertical Asymptotes</w:t>
       </w:r>
     </w:p>
     <w:p>
@@ -809,7 +809,7 @@
         <w:spacing w:after="120" w:before="80" w:line="300"/>
       </w:pPr>
       <w:r>
-        <w:t xml:space="preserve">What is the domain of f?</w:t>
+        <w:t xml:space="preserve">What are the vertical asymptotes of f?</w:t>
       </w:r>
     </w:p>
     <w:p>
@@ -825,7 +825,7 @@
         <w:t xml:space="preserve">A.  </w:t>
       </w:r>
       <w:r>
-        <w:t xml:space="preserve">All real numbers except 1</w:t>
+        <w:t xml:space="preserve">x = 1 and x = 3</w:t>
       </w:r>
     </w:p>
     <w:p>
@@ -841,7 +841,7 @@
         <w:t xml:space="preserve">B.  </w:t>
       </w:r>
       <w:r>
-        <w:t xml:space="preserve">All real numbers except −2 and 3</w:t>
+        <w:t xml:space="preserve">x = −1 only</w:t>
       </w:r>
     </w:p>
     <w:p>
@@ -857,7 +857,7 @@
         <w:t xml:space="preserve">C.  </w:t>
       </w:r>
       <w:r>
-        <w:t xml:space="preserve">All real numbers except −2, 1, and 3</w:t>
+        <w:t xml:space="preserve">x = 1 and x = −2</w:t>
       </w:r>
     </w:p>
     <w:p>
@@ -873,7 +873,7 @@
         <w:t xml:space="preserve">D.  </w:t>
       </w:r>
       <w:r>
-        <w:t xml:space="preserve">All real numbers except 1 and 3</w:t>
+        <w:t xml:space="preserve">x = 1 only</w:t>
       </w:r>
     </w:p>
     <w:p>
@@ -890,17 +890,17 @@
         <w:spacing w:after="120" w:before="80" w:line="300"/>
       </w:pPr>
       <w:r>
-        <w:t xml:space="preserve">The domain leaves out every </w:t>
-      </w:r>
-      <w:r>
-        <w:rPr>
-          <w:i/>
-          <w:iCs/>
-        </w:rPr>
-        <w:t xml:space="preserve">x</w:t>
-      </w:r>
-      <w:r>
-        <w:t xml:space="preserve"> that makes the original bottom 0: </w:t>
+        <w:t xml:space="preserve">Vertical asymptotes come from the bottom factors that are left after cancelling. </w:t>
+      </w:r>
+      <w:r>
+        <w:rPr>
+          <w:i/>
+          <w:iCs/>
+        </w:rPr>
+        <w:t xml:space="preserve">(x−3)</w:t>
+      </w:r>
+      <w:r>
+        <w:t xml:space="preserve"> is on the top and the bottom, so it cancels: </w:t>
       </w:r>
       <w:r>
         <w:rPr>
@@ -910,7 +910,35 @@
         <w:t xml:space="preserve">x=3</w:t>
       </w:r>
       <w:r>
-        <w:t xml:space="preserve"> and </w:t>
+        <w:t xml:space="preserve"> is a hole, at </w:t>
+      </w:r>
+      <w:r>
+        <w:rPr>
+          <w:i/>
+          <w:iCs/>
+        </w:rPr>
+        <w:t xml:space="preserve">(3,25/16)</w:t>
+      </w:r>
+      <w:r>
+        <w:t xml:space="preserve">, not an asymptote. </w:t>
+      </w:r>
+      <w:r>
+        <w:rPr>
+          <w:i/>
+          <w:iCs/>
+        </w:rPr>
+        <w:t xml:space="preserve">(x−1)</w:t>
+      </w:r>
+      <w:r>
+        <w:rPr>
+          <w:i/>
+          <w:iCs/>
+          <w:vertAlign w:val="superscript"/>
+        </w:rPr>
+        <w:t xml:space="preserve">2</w:t>
+      </w:r>
+      <w:r>
+        <w:t xml:space="preserve"> stays, so </w:t>
       </w:r>
       <w:r>
         <w:rPr>
@@ -920,24 +948,79 @@
         <w:t xml:space="preserve">x=1</w:t>
       </w:r>
       <w:r>
-        <w:t xml:space="preserve">. Cancelling </w:t>
-      </w:r>
-      <w:r>
-        <w:rPr>
-          <w:i/>
-          <w:iCs/>
-        </w:rPr>
-        <w:t xml:space="preserve">(x−3)</w:t>
-      </w:r>
-      <w:r>
-        <w:t xml:space="preserve"> changes the formula, not the domain, so 3 stays out, as the hole. "Except 1" alone forgets the hole, and −2 makes the top 0, which is allowed, so it does not belong on the list. "Except −2 and 3" uses the factors on the top instead of the bottom. </w:t>
-      </w:r>
-      <w:r>
-        <w:rPr>
-          <w:b/>
-          <w:bCs/>
-        </w:rPr>
-        <w:t xml:space="preserve">All real numbers except 1 and 3.</w:t>
+        <w:t xml:space="preserve"> is the vertical asymptote. The square does not make a second asymptote; it makes the graph go the same way on both sides of </w:t>
+      </w:r>
+      <w:r>
+        <w:rPr>
+          <w:i/>
+          <w:iCs/>
+        </w:rPr>
+        <w:t xml:space="preserve">x=1</w:t>
+      </w:r>
+      <w:r>
+        <w:t xml:space="preserve">, here up, since the cancelled formula </w:t>
+      </w:r>
+      <w:r>
+        <w:rPr>
+          <w:i/>
+          <w:iCs/>
+        </w:rPr>
+        <w:t xml:space="preserve">(5(x+2))/(4(x−1)</w:t>
+      </w:r>
+      <w:r>
+        <w:rPr>
+          <w:i/>
+          <w:iCs/>
+          <w:vertAlign w:val="superscript"/>
+        </w:rPr>
+        <w:t xml:space="preserve">2</w:t>
+      </w:r>
+      <w:r>
+        <w:rPr>
+          <w:i/>
+          <w:iCs/>
+        </w:rPr>
+        <w:t xml:space="preserve">)</w:t>
+      </w:r>
+      <w:r>
+        <w:t xml:space="preserve"> is a positive number over a tiny positive number near 1. Together, the asymptote and the hole give the domain: all real numbers except 1 and 3. Adding </w:t>
+      </w:r>
+      <w:r>
+        <w:rPr>
+          <w:i/>
+          <w:iCs/>
+        </w:rPr>
+        <w:t xml:space="preserve">x=3</w:t>
+      </w:r>
+      <w:r>
+        <w:t xml:space="preserve"> counts the cancelled factor; </w:t>
+      </w:r>
+      <w:r>
+        <w:rPr>
+          <w:i/>
+          <w:iCs/>
+        </w:rPr>
+        <w:t xml:space="preserve">x=−1</w:t>
+      </w:r>
+      <w:r>
+        <w:t xml:space="preserve"> reads the sign as written; and </w:t>
+      </w:r>
+      <w:r>
+        <w:rPr>
+          <w:i/>
+          <w:iCs/>
+        </w:rPr>
+        <w:t xml:space="preserve">x=−2</w:t>
+      </w:r>
+      <w:r>
+        <w:t xml:space="preserve"> is a zero, from the top. </w:t>
+      </w:r>
+      <w:r>
+        <w:rPr>
+          <w:b/>
+          <w:bCs/>
+        </w:rPr>
+        <w:t xml:space="preserve">x = 1 only.</w:t>
       </w:r>
     </w:p>
     <w:p>

</xml_diff>